<commit_message>
docs: correct upload details for filename de-duplication and Role (Lookup)
Re-verified docs against latest PR #1 commits and found two behaviors
that had landed since the last doc pass but weren't yet reflected:
- Duplicate upload filenames now auto-retry with a de-duplicated name
  instead of failing/overwriting.
- Upload now also stamps the library's Role (Lookup) column (best-effort),
  in addition to Role (Choice).

Regenerated and re-verified Word docs from the corrected markdown.

Co-authored-by: Copilot App <223556219+Copilot@users.noreply.github.com>
</commit_message>
<xml_diff>
--- a/docs/word/Role and Responsibility Documentation - Application Lifecycle (Internal).docx
+++ b/docs/word/Role and Responsibility Documentation - Application Lifecycle (Internal).docx
@@ -2815,7 +2815,73 @@
         <w:t>SopService.uploadDocument()</w:t>
       </w:r>
       <w:r>
-        <w:t xml:space="preserve"> uploads the file to the library, stamps its metadata (Role, Process lookup, Document Type, Status, Owner), and — only if the Process record's </w:t>
+        <w:t xml:space="preserve"> uploads the file to the library and stamps its metadata: </w:t>
+      </w:r>
+      <w:r>
+        <w:rPr>
+          <w:rFonts w:ascii="Consolas" w:hAnsi="Consolas"/>
+          <w:color w:val="C7254E"/>
+          <w:sz w:val="20"/>
+        </w:rPr>
+        <w:t>Role (Choice)</w:t>
+      </w:r>
+      <w:r>
+        <w:t xml:space="preserve">, the </w:t>
+      </w:r>
+      <w:r>
+        <w:rPr>
+          <w:rFonts w:ascii="Consolas" w:hAnsi="Consolas"/>
+          <w:color w:val="C7254E"/>
+          <w:sz w:val="20"/>
+        </w:rPr>
+        <w:t>Process</w:t>
+      </w:r>
+      <w:r>
+        <w:t xml:space="preserve"> lookup, Document Type, Status, </w:t>
+      </w:r>
+      <w:r>
+        <w:rPr>
+          <w:rFonts w:ascii="Consolas" w:hAnsi="Consolas"/>
+          <w:color w:val="C7254E"/>
+          <w:sz w:val="20"/>
+        </w:rPr>
+        <w:t>Owner</w:t>
+      </w:r>
+      <w:r>
+        <w:t xml:space="preserve"> (if picked), and — best-effort — </w:t>
+      </w:r>
+      <w:r>
+        <w:rPr>
+          <w:rFonts w:ascii="Consolas" w:hAnsi="Consolas"/>
+          <w:color w:val="C7254E"/>
+          <w:sz w:val="20"/>
+        </w:rPr>
+        <w:t>Role (Lookup)</w:t>
+      </w:r>
+      <w:r>
+        <w:t xml:space="preserve"> by matching the role name against the Roles list (skipped if no exact match is found, without failing the rest of the upload). If a file with the same name already exists in the library, the upload automatically retries with a de-duplicated name (</w:t>
+      </w:r>
+      <w:r>
+        <w:rPr>
+          <w:rFonts w:ascii="Consolas" w:hAnsi="Consolas"/>
+          <w:color w:val="C7254E"/>
+          <w:sz w:val="20"/>
+        </w:rPr>
+        <w:t>" (2)"</w:t>
+      </w:r>
+      <w:r>
+        <w:t xml:space="preserve">, </w:t>
+      </w:r>
+      <w:r>
+        <w:rPr>
+          <w:rFonts w:ascii="Consolas" w:hAnsi="Consolas"/>
+          <w:color w:val="C7254E"/>
+          <w:sz w:val="20"/>
+        </w:rPr>
+        <w:t>" (3)"</w:t>
+      </w:r>
+      <w:r>
+        <w:t xml:space="preserve">, ...) instead of failing or silently overwriting someone else's file. Finally, only if the Process record's </w:t>
       </w:r>
       <w:r>
         <w:rPr>
@@ -2826,7 +2892,7 @@
         <w:t>Document Link</w:t>
       </w:r>
       <w:r>
-        <w:t xml:space="preserve"> was previously blank — stamps that link too, so the process is immediately recognized as documented.</w:t>
+        <w:t xml:space="preserve"> was previously blank, that link is stamped too, so the process is immediately recognized as documented.</w:t>
       </w:r>
     </w:p>
     <w:p>

</xml_diff>

<commit_message>
docs: document per-client App Catalog membership permission requirement
Clarify that communityessentials.sharepoint.com is a multi-client tenant
where each client (e.g. Mundelein) has its own dedicated App Catalog site,
not a single shared tenant-wide catalog. Add explicit steps/prerequisites
to verify the dev/deployment account is added to that client's App
Catalog site Membership (at least Member) before uploading/deploying,
plus a troubleshooting row for the case where it hasn't been. Regenerated
and re-verified Word docs.

Co-authored-by: Copilot App <223556219+Copilot@users.noreply.github.com>
</commit_message>
<xml_diff>
--- a/docs/word/Role and Responsibility Documentation - Application Lifecycle (Internal).docx
+++ b/docs/word/Role and Responsibility Documentation - Application Lifecycle (Internal).docx
@@ -589,6 +589,20 @@
                 <w:sz w:val="20"/>
               </w:rPr>
               <w:t>communityessentials.sharepoint.com</w:t>
+            </w:r>
+            <w:r>
+              <w:t xml:space="preserve"> (a multi-client tenant — each client, including Mundelein, has its own App Catalog site, e.g. </w:t>
+            </w:r>
+            <w:r>
+              <w:rPr>
+                <w:rFonts w:ascii="Consolas" w:hAnsi="Consolas"/>
+                <w:color w:val="C7254E"/>
+                <w:sz w:val="20"/>
+              </w:rPr>
+              <w:t>Mundelein SharePoint App</w:t>
+            </w:r>
+            <w:r>
+              <w:t>)</w:t>
             </w:r>
           </w:p>
         </w:tc>
@@ -2978,7 +2992,7 @@
         <w:t>.sppkg</w:t>
       </w:r>
       <w:r>
-        <w:t xml:space="preserve"> deployed to the tenant or site collection App Catalog at </w:t>
+        <w:t xml:space="preserve"> deployed to the client's App Catalog site (its own dedicated site collection under </w:t>
       </w:r>
       <w:r>
         <w:rPr>
@@ -2989,7 +3003,39 @@
         <w:t>communityessentials.sharepoint.com</w:t>
       </w:r>
       <w:r>
-        <w:t>, then added to the page(s) that host the app.</w:t>
+        <w:t xml:space="preserve">, e.g. </w:t>
+      </w:r>
+      <w:r>
+        <w:rPr>
+          <w:rFonts w:ascii="Consolas" w:hAnsi="Consolas"/>
+          <w:color w:val="C7254E"/>
+          <w:sz w:val="20"/>
+        </w:rPr>
+        <w:t>Mundelein SharePoint App</w:t>
+      </w:r>
+      <w:r>
+        <w:t xml:space="preserve">), then added to the page(s) that host the app. </w:t>
+      </w:r>
+      <w:r>
+        <w:rPr>
+          <w:b/>
+        </w:rPr>
+        <w:t xml:space="preserve">Before deploying to a new client or with a new deployment account, verify that account is added to that App Catalog site's Membership (at least Member) — see </w:t>
+      </w:r>
+      <w:r>
+        <w:rPr>
+          <w:rFonts w:ascii="Consolas" w:hAnsi="Consolas"/>
+          <w:b/>
+          <w:color w:val="C7254E"/>
+          <w:sz w:val="20"/>
+        </w:rPr>
+        <w:t>docs/UPDATE-GUIDE.md</w:t>
+      </w:r>
+      <w:r>
+        <w:rPr>
+          <w:b/>
+        </w:rPr>
+        <w:t xml:space="preserve"> section 7.</w:t>
       </w:r>
     </w:p>
     <w:p>

</xml_diff>